<commit_message>
IJSSC R1: describe hypothesis 2 as partially supported
Co-Authored-By: Claude Opus 5.5 <noreply@anthropic.com>
</commit_message>
<xml_diff>
--- a/forskning/ncc-kohort/revision_r1/submission_r1/RESPONSE_TO_REVIEWER_R1.docx
+++ b/forskning/ncc-kohort/revision_r1/submission_r1/RESPONSE_TO_REVIEWER_R1.docx
@@ -292,7 +292,7 @@
         <w:t xml:space="preserve"> </w:t>
       </w:r>
       <w:r>
-        <w:t xml:space="preserve">With correct scoring, baseline Tyrving has a substantial independent association with retention (OR 1.75 [1.47, 2.08]; submitted 1.12, not significant). Volume still discriminates somewhat better than performance measured in the same window (AUC difference 0.040 [0.006, 0.074]), but the two are complementary, and with its within-baseline trajectory performance matches volume. Section 4.2 and the Abstract now say this, and Hypothesis 2 is described as supported only in a weak form.</w:t>
+        <w:t xml:space="preserve">With correct scoring, baseline Tyrving has a substantial independent association with retention (OR 1.75 [1.47, 2.08]; submitted 1.12, not significant). Volume still discriminates somewhat better than performance measured in the same window (AUC difference 0.040 [0.006, 0.074]), but the two are complementary, and with its within-baseline trajectory performance matches volume. Section 4.2 and the Abstract now say this, and Hypothesis 2 is described as partially supported.</w:t>
       </w:r>
     </w:p>
     <w:p>
@@ -1385,7 +1385,7 @@
         <w:t xml:space="preserve">“Competition volume and performance carry complementary information”</w:t>
       </w:r>
       <w:r>
-        <w:t xml:space="preserve">, and Hypothesis 2 is described as supported only in its weak form: behavior discriminates at least as well as performance, not instead of it.</w:t>
+        <w:t xml:space="preserve">, and Hypothesis 2 is described as partially supported: behavior discriminates at least as well as performance, not instead of it.</w:t>
       </w:r>
     </w:p>
     <w:p>

</xml_diff>

<commit_message>
IJSSC R1: club random intercepts by maximum likelihood; preempt queries
- the primary model's club random intercepts are now fitted by maximum
  likelihood (Gauss-Hermite quadrature, analytic gradient; likelihood
  checked by adaptive integration) instead of variational Bayes:
  volume OR 2.07 [1.80, 2.37], club SD 0.17, LR p = .31 (Section 3.4,
  S-M7, Table S22, response to comment 3)
- response to comment 1 explains the corrected category list in 2.4.3;
  Table S26 note separates calibration-in-the-large from the submitted
  calibration intercept; Table S21 note labels the 20-split CV-AUC

Co-Authored-By: Claude Opus 5.5 <noreply@anthropic.com>
</commit_message>
<xml_diff>
--- a/forskning/ncc-kohort/revision_r1/submission_r1/RESPONSE_TO_REVIEWER_R1.docx
+++ b/forskning/ncc-kohort/revision_r1/submission_r1/RESPONSE_TO_REVIEWER_R1.docx
@@ -416,7 +416,7 @@
         <w:t xml:space="preserve"> </w:t>
       </w:r>
       <w:r>
-        <w:t xml:space="preserve">Thank you; the reviewer is correct, and this was an error rather than a design choice. The submitted index pooled every result up to the end of the second calendar year after the baseline meet, so depending on baseline age it covered ages 11–16 (about 35,000 of its results came from ages 15–16). The primary model was therefore not strictly baseline-only. The index is now computed from results in the age-13 and age-14 calendar years only, the same window as the volume predictor, and every model containing HHI has been re-estimated.</w:t>
+        <w:t xml:space="preserve">Thank you; the reviewer is correct, and this was an error rather than a design choice. The submitted index pooled every result up to the end of the second calendar year after the baseline meet, so depending on baseline age it covered ages 11–16 (about 35,000 of its results came from ages 15–16). The primary model was therefore not strictly baseline-only. The index is now computed from results in the age-13 and age-14 calendar years only, the same window as the volume predictor, and every model containing HHI has been re-estimated. We also corrected the list of categories in Section 2.4.3: the index has always used the register’s own event categories, but the submitted text listed combined events and relays, which the register does not use as categories, and omitted steeplechase and ball throws.</w:t>
       </w:r>
     </w:p>
     <w:p>
@@ -580,7 +580,7 @@
         <w:pStyle w:val="FirstParagraph"/>
       </w:pPr>
       <w:r>
-        <w:t xml:space="preserve">Together with the club random-intercept model (volume OR 2.10) and club-clustered standard errors (2.04 [1.75, 2.39]), this shows that the association holds within clubs and carries over to clubs not used for fitting. (The ICC of volume is 0.27 in the corrected data.)</w:t>
+        <w:t xml:space="preserve">Together with the club random-intercept model, now fitted by maximum likelihood (volume OR 2.07 [1.80, 2.37]; the clubs differ little in retention itself: SD of the club intercepts 0.17, likelihood-ratio p = .31), and club-clustered standard errors (2.04 [1.75, 2.39]), this shows that the association holds within clubs and carries over to clubs not used for fitting. (The ICC of volume is 0.27 in the corrected data.)</w:t>
       </w:r>
     </w:p>
     <w:p>

</xml_diff>